<commit_message>
Charter One: Adobe Creative Suite incl. Illustrator, and end title graphic design
Added to the Apache Junction resume (replacing the AI workflow bullet to
keep four), its skills line, and the reference sheet's InDesign gap note.
Recorded in the candidate profile so future resumes can use it.

Co-Authored-By: Claude Opus 5.5 <noreply@anthropic.com>
Claude-Session: https://claude.ai/code/session_01VpCXqDFSAKkK8y6mKL2HCw
</commit_message>
<xml_diff>
--- a/Job Hunt 2026/2026-10-23 - City of Apache Junction - Multimedia Specialist/Job Description & Company Research - City of Apache Junction.docx
+++ b/Job Hunt 2026/2026-10-23 - City of Apache Junction - Multimedia Specialist/Job Description & Company Research - City of Apache Junction.docx
@@ -44,7 +44,7 @@
         </w:rPr>
         <w:t xml:space="preserve">APPLY:  </w:t>
       </w:r>
-      <w:hyperlink w:history="1" r:id="rId-bjiqjhhqy03tpwgkeow-">
+      <w:hyperlink w:history="1" r:id="rIdak7mgk-ew_6gx7k0ljbhj">
         <w:r>
           <w:rPr>
             <w:rFonts w:ascii="Calibri" w:cs="Calibri" w:eastAsia="Calibri" w:hAnsi="Calibri"/>
@@ -539,7 +539,7 @@
             </w:tcBorders>
           </w:tcPr>
           <w:p>
-            <w:hyperlink w:history="1" r:id="rIdxu18d0w2p7-0moy9wzwkh">
+            <w:hyperlink w:history="1" r:id="rId3easrzegtkz_bdezpkmez">
               <w:r>
                 <w:rPr>
                   <w:rStyle w:val="Hyperlink"/>
@@ -745,7 +745,7 @@
           <w:sz w:val="21"/>
           <w:szCs w:val="21"/>
         </w:rPr>
-        <w:t xml:space="preserve">InDesign and Illustrator are named; his design tools are Photoshop and Canva</w:t>
+        <w:t xml:space="preserve">InDesign is named for print layout and is not in his record. His design work is in Illustrator, Photoshop, and Canva, including end title graphics for Charter One videos. Answer: "I design in Illustrator and Photoshop every week for video graphics; InDesign is the same Adobe toolset, and I would be productive in it quickly."</w:t>
       </w:r>
     </w:p>
     <w:p>
@@ -1093,7 +1093,7 @@
         </w:rPr>
         <w:t xml:space="preserve"> </w:t>
       </w:r>
-      <w:hyperlink w:history="1" r:id="rIdcbns4pgmxfoxle2rkx0qu">
+      <w:hyperlink w:history="1" r:id="rIdisprtnjto3snngfsncw4a">
         <w:r>
           <w:rPr>
             <w:rFonts w:ascii="Calibri" w:cs="Calibri" w:eastAsia="Calibri" w:hAnsi="Calibri"/>
@@ -1155,7 +1155,7 @@
         </w:rPr>
         <w:t xml:space="preserve"> </w:t>
       </w:r>
-      <w:hyperlink w:history="1" r:id="rIdq8bjqsukktscfx7q3eczs">
+      <w:hyperlink w:history="1" r:id="rIdds4b05ci-xwolki32mdjn">
         <w:r>
           <w:rPr>
             <w:rFonts w:ascii="Calibri" w:cs="Calibri" w:eastAsia="Calibri" w:hAnsi="Calibri"/>
@@ -1197,7 +1197,7 @@
         </w:rPr>
         <w:t xml:space="preserve">Reddit could not be searched for this sheet: Reddit blocks the automated search Claude uses. Open the link to read what people say there. </w:t>
       </w:r>
-      <w:hyperlink w:history="1" r:id="rIdkyhnxxn8kalt74kvb9lij">
+      <w:hyperlink w:history="1" r:id="rIdio4comthsnrffbanv2jly">
         <w:r>
           <w:rPr>
             <w:rFonts w:ascii="Calibri" w:cs="Calibri" w:eastAsia="Calibri" w:hAnsi="Calibri"/>
@@ -1272,7 +1272,7 @@
         </w:rPr>
         <w:t xml:space="preserve"> </w:t>
       </w:r>
-      <w:hyperlink w:history="1" r:id="rIdekb04f2azxbt0a3sh2mr6">
+      <w:hyperlink w:history="1" r:id="rIdiwuqplj3udxv2udipxklv">
         <w:r>
           <w:rPr>
             <w:rFonts w:ascii="Calibri" w:cs="Calibri" w:eastAsia="Calibri" w:hAnsi="Calibri"/>
@@ -1292,7 +1292,7 @@
         </w:rPr>
         <w:t xml:space="preserve"> </w:t>
       </w:r>
-      <w:hyperlink w:history="1" r:id="rIdn9w-ozncbwoky1427fi3d">
+      <w:hyperlink w:history="1" r:id="rIdyfmsemanrmnwid3jmcweh">
         <w:r>
           <w:rPr>
             <w:rFonts w:ascii="Calibri" w:cs="Calibri" w:eastAsia="Calibri" w:hAnsi="Calibri"/>
@@ -1312,7 +1312,7 @@
         </w:rPr>
         <w:t xml:space="preserve"> </w:t>
       </w:r>
-      <w:hyperlink w:history="1" r:id="rIds4b6azey8oypydzfq7qgl">
+      <w:hyperlink w:history="1" r:id="rIdilt34o7cublratqf9tisx">
         <w:r>
           <w:rPr>
             <w:rFonts w:ascii="Calibri" w:cs="Calibri" w:eastAsia="Calibri" w:hAnsi="Calibri"/>
@@ -1332,7 +1332,7 @@
         </w:rPr>
         <w:t xml:space="preserve"> </w:t>
       </w:r>
-      <w:hyperlink w:history="1" r:id="rIdmvwrcianlddaem-euuvgl">
+      <w:hyperlink w:history="1" r:id="rIdof56w2suzwtx8pgq1dbii">
         <w:r>
           <w:rPr>
             <w:rFonts w:ascii="Calibri" w:cs="Calibri" w:eastAsia="Calibri" w:hAnsi="Calibri"/>
@@ -1371,7 +1371,7 @@
         </w:rPr>
         <w:t xml:space="preserve"> </w:t>
       </w:r>
-      <w:hyperlink w:history="1" r:id="rIdmbhv5pbnjz2jcij6wbrsq">
+      <w:hyperlink w:history="1" r:id="rIdypokfxlc51k1uqtzy7bfl">
         <w:r>
           <w:rPr>
             <w:rFonts w:ascii="Calibri" w:cs="Calibri" w:eastAsia="Calibri" w:hAnsi="Calibri"/>
@@ -1391,7 +1391,7 @@
         </w:rPr>
         <w:t xml:space="preserve"> </w:t>
       </w:r>
-      <w:hyperlink w:history="1" r:id="rIdzfmogucnnsuoydd4kycpj">
+      <w:hyperlink w:history="1" r:id="rIdopr7s1pyrvgysjommu02c">
         <w:r>
           <w:rPr>
             <w:rFonts w:ascii="Calibri" w:cs="Calibri" w:eastAsia="Calibri" w:hAnsi="Calibri"/>
@@ -1411,7 +1411,7 @@
         </w:rPr>
         <w:t xml:space="preserve"> </w:t>
       </w:r>
-      <w:hyperlink w:history="1" r:id="rId_tr3nebho0tszpnnc2vsu">
+      <w:hyperlink w:history="1" r:id="rId9iac6uuc__uoib94sqimh">
         <w:r>
           <w:rPr>
             <w:rFonts w:ascii="Calibri" w:cs="Calibri" w:eastAsia="Calibri" w:hAnsi="Calibri"/>
@@ -1450,7 +1450,7 @@
         </w:rPr>
         <w:t xml:space="preserve"> </w:t>
       </w:r>
-      <w:hyperlink w:history="1" r:id="rId4g9vgzeamo4slpndsqepm">
+      <w:hyperlink w:history="1" r:id="rIdtamjfxzednfm-a9an6_xp">
         <w:r>
           <w:rPr>
             <w:rFonts w:ascii="Calibri" w:cs="Calibri" w:eastAsia="Calibri" w:hAnsi="Calibri"/>
@@ -1470,7 +1470,7 @@
         </w:rPr>
         <w:t xml:space="preserve"> </w:t>
       </w:r>
-      <w:hyperlink w:history="1" r:id="rIdmb8rpza5qfg_yqxtqd201">
+      <w:hyperlink w:history="1" r:id="rIdtjo32ceelc6sbizqpdohb">
         <w:r>
           <w:rPr>
             <w:rFonts w:ascii="Calibri" w:cs="Calibri" w:eastAsia="Calibri" w:hAnsi="Calibri"/>
@@ -1490,7 +1490,7 @@
         </w:rPr>
         <w:t xml:space="preserve"> </w:t>
       </w:r>
-      <w:hyperlink w:history="1" r:id="rIdnb5tvhtbudane_c65dna9">
+      <w:hyperlink w:history="1" r:id="rIdo8ivgb7wb9jxfnoxyxfdn">
         <w:r>
           <w:rPr>
             <w:rFonts w:ascii="Calibri" w:cs="Calibri" w:eastAsia="Calibri" w:hAnsi="Calibri"/>
@@ -1529,7 +1529,7 @@
         </w:rPr>
         <w:t xml:space="preserve"> </w:t>
       </w:r>
-      <w:hyperlink w:history="1" r:id="rIdt12etoay9zpv1fvyoiohx">
+      <w:hyperlink w:history="1" r:id="rIdj7kcz1ktinxruo1l1kcro">
         <w:r>
           <w:rPr>
             <w:rFonts w:ascii="Calibri" w:cs="Calibri" w:eastAsia="Calibri" w:hAnsi="Calibri"/>
@@ -1568,7 +1568,7 @@
         </w:rPr>
         <w:t xml:space="preserve"> </w:t>
       </w:r>
-      <w:hyperlink w:history="1" r:id="rId6c8int9cu4-e0tjmjjsha">
+      <w:hyperlink w:history="1" r:id="rIdgpyonz2gvtktdx8iyhlex">
         <w:r>
           <w:rPr>
             <w:rFonts w:ascii="Calibri" w:cs="Calibri" w:eastAsia="Calibri" w:hAnsi="Calibri"/>
@@ -1588,7 +1588,7 @@
         </w:rPr>
         <w:t xml:space="preserve"> </w:t>
       </w:r>
-      <w:hyperlink w:history="1" r:id="rIdpzeezhmgj3dry_zfu4b1x">
+      <w:hyperlink w:history="1" r:id="rId_ldzomlxw25oskz3rmqxs">
         <w:r>
           <w:rPr>
             <w:rFonts w:ascii="Calibri" w:cs="Calibri" w:eastAsia="Calibri" w:hAnsi="Calibri"/>
@@ -1627,7 +1627,7 @@
         </w:rPr>
         <w:t xml:space="preserve"> </w:t>
       </w:r>
-      <w:hyperlink w:history="1" r:id="rId-gs7slpr4cypemyn_zbci">
+      <w:hyperlink w:history="1" r:id="rId9dtsooivaj5a7j4_kauwa">
         <w:r>
           <w:rPr>
             <w:rFonts w:ascii="Calibri" w:cs="Calibri" w:eastAsia="Calibri" w:hAnsi="Calibri"/>
@@ -1647,7 +1647,7 @@
         </w:rPr>
         <w:t xml:space="preserve"> </w:t>
       </w:r>
-      <w:hyperlink w:history="1" r:id="rIdayamoqiazpx6xa3acunfc">
+      <w:hyperlink w:history="1" r:id="rId5konfj8tjw38wj66ynlkz">
         <w:r>
           <w:rPr>
             <w:rFonts w:ascii="Calibri" w:cs="Calibri" w:eastAsia="Calibri" w:hAnsi="Calibri"/>
@@ -1667,7 +1667,7 @@
         </w:rPr>
         <w:t xml:space="preserve"> </w:t>
       </w:r>
-      <w:hyperlink w:history="1" r:id="rIdsb9pd1pplpoccf5dsukrf">
+      <w:hyperlink w:history="1" r:id="rIdhpvjsg1qwmy3uvcch1lv5">
         <w:r>
           <w:rPr>
             <w:rFonts w:ascii="Calibri" w:cs="Calibri" w:eastAsia="Calibri" w:hAnsi="Calibri"/>
@@ -1687,7 +1687,7 @@
         </w:rPr>
         <w:t xml:space="preserve"> </w:t>
       </w:r>
-      <w:hyperlink w:history="1" r:id="rIdbhf5lwkab_t6bms5942mc">
+      <w:hyperlink w:history="1" r:id="rIdaruwia06ckssuex_bq8j9">
         <w:r>
           <w:rPr>
             <w:rFonts w:ascii="Calibri" w:cs="Calibri" w:eastAsia="Calibri" w:hAnsi="Calibri"/>
@@ -1742,7 +1742,7 @@
         </w:rPr>
         <w:t xml:space="preserve"> </w:t>
       </w:r>
-      <w:hyperlink w:history="1" r:id="rId0err3u2qvuagdr6cxknm1">
+      <w:hyperlink w:history="1" r:id="rId2qwebfhxwfz1h8ey8vb4h">
         <w:r>
           <w:rPr>
             <w:rFonts w:ascii="Calibri" w:cs="Calibri" w:eastAsia="Calibri" w:hAnsi="Calibri"/>
@@ -1781,7 +1781,7 @@
         </w:rPr>
         <w:t xml:space="preserve"> </w:t>
       </w:r>
-      <w:hyperlink w:history="1" r:id="rIdahojeulsbus_wsm4e2zlm">
+      <w:hyperlink w:history="1" r:id="rIdlcvva2xjsf3_ufcvmoacu">
         <w:r>
           <w:rPr>
             <w:rFonts w:ascii="Calibri" w:cs="Calibri" w:eastAsia="Calibri" w:hAnsi="Calibri"/>
@@ -1801,7 +1801,7 @@
         </w:rPr>
         <w:t xml:space="preserve"> </w:t>
       </w:r>
-      <w:hyperlink w:history="1" r:id="rIdtj0kmcyy3q17wrcn2vhp5">
+      <w:hyperlink w:history="1" r:id="rIdcb57mowns5dl1lblxbcfi">
         <w:r>
           <w:rPr>
             <w:rFonts w:ascii="Calibri" w:cs="Calibri" w:eastAsia="Calibri" w:hAnsi="Calibri"/>
@@ -1821,7 +1821,7 @@
         </w:rPr>
         <w:t xml:space="preserve"> </w:t>
       </w:r>
-      <w:hyperlink w:history="1" r:id="rId1nttmltv6hykvmr2sss0c">
+      <w:hyperlink w:history="1" r:id="rIdwhlwsr_crvofhus3hdytr">
         <w:r>
           <w:rPr>
             <w:rFonts w:ascii="Calibri" w:cs="Calibri" w:eastAsia="Calibri" w:hAnsi="Calibri"/>
@@ -1860,7 +1860,7 @@
         </w:rPr>
         <w:t xml:space="preserve"> </w:t>
       </w:r>
-      <w:hyperlink w:history="1" r:id="rIdw6wrqve6jdigcmoxkxa09">
+      <w:hyperlink w:history="1" r:id="rIdquqnuykb965yw1wcpvvza">
         <w:r>
           <w:rPr>
             <w:rFonts w:ascii="Calibri" w:cs="Calibri" w:eastAsia="Calibri" w:hAnsi="Calibri"/>
@@ -1880,7 +1880,7 @@
         </w:rPr>
         <w:t xml:space="preserve"> </w:t>
       </w:r>
-      <w:hyperlink w:history="1" r:id="rIdb4-jve0y8syqwhfwyhuka">
+      <w:hyperlink w:history="1" r:id="rIdppxg1gezhxdxyfeokrxe5">
         <w:r>
           <w:rPr>
             <w:rFonts w:ascii="Calibri" w:cs="Calibri" w:eastAsia="Calibri" w:hAnsi="Calibri"/>
@@ -1900,7 +1900,7 @@
         </w:rPr>
         <w:t xml:space="preserve"> </w:t>
       </w:r>
-      <w:hyperlink w:history="1" r:id="rId3ivgjrv09-6rwmelbd4_v">
+      <w:hyperlink w:history="1" r:id="rIdupbizqij_ixaxqsfuohjs">
         <w:r>
           <w:rPr>
             <w:rFonts w:ascii="Calibri" w:cs="Calibri" w:eastAsia="Calibri" w:hAnsi="Calibri"/>
@@ -1939,7 +1939,7 @@
         </w:rPr>
         <w:t xml:space="preserve"> </w:t>
       </w:r>
-      <w:hyperlink w:history="1" r:id="rIduj325diu0eqnnyxdmh_0g">
+      <w:hyperlink w:history="1" r:id="rIdvxtjrtib-j_sfz3umu2gu">
         <w:r>
           <w:rPr>
             <w:rFonts w:ascii="Calibri" w:cs="Calibri" w:eastAsia="Calibri" w:hAnsi="Calibri"/>
@@ -1959,7 +1959,7 @@
         </w:rPr>
         <w:t xml:space="preserve"> </w:t>
       </w:r>
-      <w:hyperlink w:history="1" r:id="rIdwbynyso0njm8zjjkhjhxz">
+      <w:hyperlink w:history="1" r:id="rIdbxy9uwqt1awdwhztnkemp">
         <w:r>
           <w:rPr>
             <w:rFonts w:ascii="Calibri" w:cs="Calibri" w:eastAsia="Calibri" w:hAnsi="Calibri"/>
@@ -1979,7 +1979,7 @@
         </w:rPr>
         <w:t xml:space="preserve"> </w:t>
       </w:r>
-      <w:hyperlink w:history="1" r:id="rIdi48zymi6mub3dg8qmwmlr">
+      <w:hyperlink w:history="1" r:id="rIdpstlfjoxoydyyizpatmme">
         <w:r>
           <w:rPr>
             <w:rFonts w:ascii="Calibri" w:cs="Calibri" w:eastAsia="Calibri" w:hAnsi="Calibri"/>
@@ -2018,7 +2018,7 @@
         </w:rPr>
         <w:t xml:space="preserve"> </w:t>
       </w:r>
-      <w:hyperlink w:history="1" r:id="rIdrwdagfzduvuxk24ddqrxq">
+      <w:hyperlink w:history="1" r:id="rIdgxtrolkx8ad3bzsq2iho1">
         <w:r>
           <w:rPr>
             <w:rFonts w:ascii="Calibri" w:cs="Calibri" w:eastAsia="Calibri" w:hAnsi="Calibri"/>
@@ -2057,7 +2057,7 @@
         </w:rPr>
         <w:t xml:space="preserve"> </w:t>
       </w:r>
-      <w:hyperlink w:history="1" r:id="rIdjsiigum12gwd0k2dgmuno">
+      <w:hyperlink w:history="1" r:id="rIdukir4zsqdy9w4ttyranhl">
         <w:r>
           <w:rPr>
             <w:rFonts w:ascii="Calibri" w:cs="Calibri" w:eastAsia="Calibri" w:hAnsi="Calibri"/>
@@ -2077,7 +2077,7 @@
         </w:rPr>
         <w:t xml:space="preserve"> </w:t>
       </w:r>
-      <w:hyperlink w:history="1" r:id="rIdzzvfgextrf2fh1tglnxjn">
+      <w:hyperlink w:history="1" r:id="rIdehpwfk4pw8mqwhvnuvihf">
         <w:r>
           <w:rPr>
             <w:rFonts w:ascii="Calibri" w:cs="Calibri" w:eastAsia="Calibri" w:hAnsi="Calibri"/>
@@ -2116,7 +2116,7 @@
         </w:rPr>
         <w:t xml:space="preserve"> </w:t>
       </w:r>
-      <w:hyperlink w:history="1" r:id="rIddokydmz5pwlejytyjzgdr">
+      <w:hyperlink w:history="1" r:id="rIdigkhmi-yhydnjqot4xgvm">
         <w:r>
           <w:rPr>
             <w:rFonts w:ascii="Calibri" w:cs="Calibri" w:eastAsia="Calibri" w:hAnsi="Calibri"/>
@@ -2136,7 +2136,7 @@
         </w:rPr>
         <w:t xml:space="preserve"> </w:t>
       </w:r>
-      <w:hyperlink w:history="1" r:id="rId0jz-gypzmoec6qzreartk">
+      <w:hyperlink w:history="1" r:id="rIdfcdyr-mrqxj--1kmdw905">
         <w:r>
           <w:rPr>
             <w:rFonts w:ascii="Calibri" w:cs="Calibri" w:eastAsia="Calibri" w:hAnsi="Calibri"/>
@@ -2374,7 +2374,7 @@
         </w:numPr>
         <w:spacing w:after="50" w:line="259"/>
       </w:pPr>
-      <w:hyperlink w:history="1" r:id="rId4cnftgt_cubwiupdatnjr">
+      <w:hyperlink w:history="1" r:id="rIdaeiiogwpir8zaduyv3ab_">
         <w:r>
           <w:rPr>
             <w:rFonts w:ascii="Calibri" w:cs="Calibri" w:eastAsia="Calibri" w:hAnsi="Calibri"/>
@@ -2405,7 +2405,7 @@
         </w:numPr>
         <w:spacing w:after="50" w:line="259"/>
       </w:pPr>
-      <w:hyperlink w:history="1" r:id="rIdb2zh0oqjwt2cros4pfcpj">
+      <w:hyperlink w:history="1" r:id="rIdjnqldwcbbjbhp_8luabxv">
         <w:r>
           <w:rPr>
             <w:rFonts w:ascii="Calibri" w:cs="Calibri" w:eastAsia="Calibri" w:hAnsi="Calibri"/>
@@ -2436,7 +2436,7 @@
         </w:numPr>
         <w:spacing w:after="50" w:line="259"/>
       </w:pPr>
-      <w:hyperlink w:history="1" r:id="rIdn4mjnkopghdepmqbwd4i2">
+      <w:hyperlink w:history="1" r:id="rIdgsbqueu7ranocyf1aggbv">
         <w:r>
           <w:rPr>
             <w:rFonts w:ascii="Calibri" w:cs="Calibri" w:eastAsia="Calibri" w:hAnsi="Calibri"/>
@@ -2467,7 +2467,7 @@
         </w:numPr>
         <w:spacing w:after="50" w:line="259"/>
       </w:pPr>
-      <w:hyperlink w:history="1" r:id="rIdtwxoqn-r5_6t28fwlgd0z">
+      <w:hyperlink w:history="1" r:id="rIdoo_lh3jo55ru8060slbip">
         <w:r>
           <w:rPr>
             <w:rFonts w:ascii="Calibri" w:cs="Calibri" w:eastAsia="Calibri" w:hAnsi="Calibri"/>
@@ -2498,7 +2498,7 @@
         </w:numPr>
         <w:spacing w:after="50" w:line="259"/>
       </w:pPr>
-      <w:hyperlink w:history="1" r:id="rIdmhvnpgof1zsieimwamn9n">
+      <w:hyperlink w:history="1" r:id="rId2urrqjb3a4x5ueyznxuck">
         <w:r>
           <w:rPr>
             <w:rFonts w:ascii="Calibri" w:cs="Calibri" w:eastAsia="Calibri" w:hAnsi="Calibri"/>
@@ -2529,7 +2529,7 @@
         </w:numPr>
         <w:spacing w:after="50" w:line="259"/>
       </w:pPr>
-      <w:hyperlink w:history="1" r:id="rId0hjahmt7c0pvgnolhxu3s">
+      <w:hyperlink w:history="1" r:id="rId3yzcprktlzageqjmcyehv">
         <w:r>
           <w:rPr>
             <w:rFonts w:ascii="Calibri" w:cs="Calibri" w:eastAsia="Calibri" w:hAnsi="Calibri"/>
@@ -2560,7 +2560,7 @@
         </w:numPr>
         <w:spacing w:after="50" w:line="259"/>
       </w:pPr>
-      <w:hyperlink w:history="1" r:id="rId0ocd_n85efcvcqrkbixfh">
+      <w:hyperlink w:history="1" r:id="rIdhh44m7z9qekbmr94xj9d9">
         <w:r>
           <w:rPr>
             <w:rFonts w:ascii="Calibri" w:cs="Calibri" w:eastAsia="Calibri" w:hAnsi="Calibri"/>
@@ -2591,7 +2591,7 @@
         </w:numPr>
         <w:spacing w:after="50" w:line="259"/>
       </w:pPr>
-      <w:hyperlink w:history="1" r:id="rIduvl9wbk9cxvt6tyqbl_ak">
+      <w:hyperlink w:history="1" r:id="rIdirnjuf-fl3segxten8qiq">
         <w:r>
           <w:rPr>
             <w:rFonts w:ascii="Calibri" w:cs="Calibri" w:eastAsia="Calibri" w:hAnsi="Calibri"/>
@@ -2622,7 +2622,7 @@
         </w:numPr>
         <w:spacing w:after="50" w:line="259"/>
       </w:pPr>
-      <w:hyperlink w:history="1" r:id="rIdfrzi5b0x2avez59i13m2n">
+      <w:hyperlink w:history="1" r:id="rIdk23crmhfyg0ytt6vqpwok">
         <w:r>
           <w:rPr>
             <w:rFonts w:ascii="Calibri" w:cs="Calibri" w:eastAsia="Calibri" w:hAnsi="Calibri"/>
@@ -2653,7 +2653,7 @@
         </w:numPr>
         <w:spacing w:after="50" w:line="259"/>
       </w:pPr>
-      <w:hyperlink w:history="1" r:id="rIdkfjliba8-vnkyd1he-5xf">
+      <w:hyperlink w:history="1" r:id="rIdlyj0ub6fmcd_36yer5xn5">
         <w:r>
           <w:rPr>
             <w:rFonts w:ascii="Calibri" w:cs="Calibri" w:eastAsia="Calibri" w:hAnsi="Calibri"/>
@@ -2684,7 +2684,7 @@
         </w:numPr>
         <w:spacing w:after="50" w:line="259"/>
       </w:pPr>
-      <w:hyperlink w:history="1" r:id="rIdnp-xuh8oadegxugfntbce">
+      <w:hyperlink w:history="1" r:id="rIdncda3wzgcakawrtkpsgsi">
         <w:r>
           <w:rPr>
             <w:rFonts w:ascii="Calibri" w:cs="Calibri" w:eastAsia="Calibri" w:hAnsi="Calibri"/>
@@ -2715,7 +2715,7 @@
         </w:numPr>
         <w:spacing w:after="50" w:line="259"/>
       </w:pPr>
-      <w:hyperlink w:history="1" r:id="rId5zno7altsyy1zsxecm7rn">
+      <w:hyperlink w:history="1" r:id="rId38pybcjozdxjdm7sndphi">
         <w:r>
           <w:rPr>
             <w:rFonts w:ascii="Calibri" w:cs="Calibri" w:eastAsia="Calibri" w:hAnsi="Calibri"/>
@@ -2746,7 +2746,7 @@
         </w:numPr>
         <w:spacing w:after="50" w:line="259"/>
       </w:pPr>
-      <w:hyperlink w:history="1" r:id="rIdc49o8saivetn8adap4mq0">
+      <w:hyperlink w:history="1" r:id="rIdx4s-bpzonikzvq_igfyim">
         <w:r>
           <w:rPr>
             <w:rFonts w:ascii="Calibri" w:cs="Calibri" w:eastAsia="Calibri" w:hAnsi="Calibri"/>
@@ -2777,7 +2777,7 @@
         </w:numPr>
         <w:spacing w:after="50" w:line="259"/>
       </w:pPr>
-      <w:hyperlink w:history="1" r:id="rIdqkrzxa5dvo0-kmcefiam9">
+      <w:hyperlink w:history="1" r:id="rIdijlkh28e5h67mrjywl6zv">
         <w:r>
           <w:rPr>
             <w:rFonts w:ascii="Calibri" w:cs="Calibri" w:eastAsia="Calibri" w:hAnsi="Calibri"/>
@@ -2808,7 +2808,7 @@
         </w:numPr>
         <w:spacing w:after="50" w:line="259"/>
       </w:pPr>
-      <w:hyperlink w:history="1" r:id="rId1llclesdfeouupjlpsldv">
+      <w:hyperlink w:history="1" r:id="rIdnya5t_gdavt-fvi84pomz">
         <w:r>
           <w:rPr>
             <w:rFonts w:ascii="Calibri" w:cs="Calibri" w:eastAsia="Calibri" w:hAnsi="Calibri"/>
@@ -2839,7 +2839,7 @@
         </w:numPr>
         <w:spacing w:after="50" w:line="259"/>
       </w:pPr>
-      <w:hyperlink w:history="1" r:id="rIdgakrs8cb-2onerhej-n95">
+      <w:hyperlink w:history="1" r:id="rIdqoxdsg7bfy2rw__iv_rtl">
         <w:r>
           <w:rPr>
             <w:rFonts w:ascii="Calibri" w:cs="Calibri" w:eastAsia="Calibri" w:hAnsi="Calibri"/>
@@ -2870,7 +2870,7 @@
         </w:numPr>
         <w:spacing w:after="50" w:line="259"/>
       </w:pPr>
-      <w:hyperlink w:history="1" r:id="rIddipwg-z3ycnpkptcyifla">
+      <w:hyperlink w:history="1" r:id="rIdjaezrpf9ayah9co63ybm5">
         <w:r>
           <w:rPr>
             <w:rFonts w:ascii="Calibri" w:cs="Calibri" w:eastAsia="Calibri" w:hAnsi="Calibri"/>

</xml_diff>

<commit_message>
Charter One Adobe bullet: 'Utilized' instead of 'Designed' (Joshua's wording)
Co-Authored-By: Claude Opus 5.5 <noreply@anthropic.com>
Claude-Session: https://claude.ai/code/session_01VpCXqDFSAKkK8y6mKL2HCw
</commit_message>
<xml_diff>
--- a/Job Hunt 2026/2026-10-23 - City of Apache Junction - Multimedia Specialist/Job Description & Company Research - City of Apache Junction.docx
+++ b/Job Hunt 2026/2026-10-23 - City of Apache Junction - Multimedia Specialist/Job Description & Company Research - City of Apache Junction.docx
@@ -44,7 +44,7 @@
         </w:rPr>
         <w:t xml:space="preserve">APPLY:  </w:t>
       </w:r>
-      <w:hyperlink w:history="1" r:id="rIdak7mgk-ew_6gx7k0ljbhj">
+      <w:hyperlink w:history="1" r:id="rId0y10mg2ea1ac90fb21oci">
         <w:r>
           <w:rPr>
             <w:rFonts w:ascii="Calibri" w:cs="Calibri" w:eastAsia="Calibri" w:hAnsi="Calibri"/>
@@ -539,7 +539,7 @@
             </w:tcBorders>
           </w:tcPr>
           <w:p>
-            <w:hyperlink w:history="1" r:id="rId3easrzegtkz_bdezpkmez">
+            <w:hyperlink w:history="1" r:id="rIdre1ygvuntqdsypq7zi6z_">
               <w:r>
                 <w:rPr>
                   <w:rStyle w:val="Hyperlink"/>
@@ -745,7 +745,7 @@
           <w:sz w:val="21"/>
           <w:szCs w:val="21"/>
         </w:rPr>
-        <w:t xml:space="preserve">InDesign is named for print layout and is not in his record. His design work is in Illustrator, Photoshop, and Canva, including end title graphics for Charter One videos. Answer: "I design in Illustrator and Photoshop every week for video graphics; InDesign is the same Adobe toolset, and I would be productive in it quickly."</w:t>
+        <w:t xml:space="preserve">InDesign is named for print layout and is not in his record. He uses Illustrator and Photoshop for end title graphics on his videos, plus Canva. Answer: "I use Illustrator and Photoshop for title graphics on my videos. InDesign is part of the same Adobe suite, and I would be productive in it quickly."</w:t>
       </w:r>
     </w:p>
     <w:p>
@@ -1093,7 +1093,7 @@
         </w:rPr>
         <w:t xml:space="preserve"> </w:t>
       </w:r>
-      <w:hyperlink w:history="1" r:id="rIdisprtnjto3snngfsncw4a">
+      <w:hyperlink w:history="1" r:id="rIdbsucgapa8lbhck4hvef8o">
         <w:r>
           <w:rPr>
             <w:rFonts w:ascii="Calibri" w:cs="Calibri" w:eastAsia="Calibri" w:hAnsi="Calibri"/>
@@ -1155,7 +1155,7 @@
         </w:rPr>
         <w:t xml:space="preserve"> </w:t>
       </w:r>
-      <w:hyperlink w:history="1" r:id="rIdds4b05ci-xwolki32mdjn">
+      <w:hyperlink w:history="1" r:id="rIdokaymfedc6hobl1ufwuqa">
         <w:r>
           <w:rPr>
             <w:rFonts w:ascii="Calibri" w:cs="Calibri" w:eastAsia="Calibri" w:hAnsi="Calibri"/>
@@ -1197,7 +1197,7 @@
         </w:rPr>
         <w:t xml:space="preserve">Reddit could not be searched for this sheet: Reddit blocks the automated search Claude uses. Open the link to read what people say there. </w:t>
       </w:r>
-      <w:hyperlink w:history="1" r:id="rIdio4comthsnrffbanv2jly">
+      <w:hyperlink w:history="1" r:id="rIdsof4sd93i86gxdxzfnbb8">
         <w:r>
           <w:rPr>
             <w:rFonts w:ascii="Calibri" w:cs="Calibri" w:eastAsia="Calibri" w:hAnsi="Calibri"/>
@@ -1272,7 +1272,7 @@
         </w:rPr>
         <w:t xml:space="preserve"> </w:t>
       </w:r>
-      <w:hyperlink w:history="1" r:id="rIdiwuqplj3udxv2udipxklv">
+      <w:hyperlink w:history="1" r:id="rIduokno0zmi4t2izuaixe0o">
         <w:r>
           <w:rPr>
             <w:rFonts w:ascii="Calibri" w:cs="Calibri" w:eastAsia="Calibri" w:hAnsi="Calibri"/>
@@ -1292,7 +1292,7 @@
         </w:rPr>
         <w:t xml:space="preserve"> </w:t>
       </w:r>
-      <w:hyperlink w:history="1" r:id="rIdyfmsemanrmnwid3jmcweh">
+      <w:hyperlink w:history="1" r:id="rIdp85mukvmlimfwdr32o7nj">
         <w:r>
           <w:rPr>
             <w:rFonts w:ascii="Calibri" w:cs="Calibri" w:eastAsia="Calibri" w:hAnsi="Calibri"/>
@@ -1312,7 +1312,7 @@
         </w:rPr>
         <w:t xml:space="preserve"> </w:t>
       </w:r>
-      <w:hyperlink w:history="1" r:id="rIdilt34o7cublratqf9tisx">
+      <w:hyperlink w:history="1" r:id="rIdgy_atvuz6d7z82chwbem7">
         <w:r>
           <w:rPr>
             <w:rFonts w:ascii="Calibri" w:cs="Calibri" w:eastAsia="Calibri" w:hAnsi="Calibri"/>
@@ -1332,7 +1332,7 @@
         </w:rPr>
         <w:t xml:space="preserve"> </w:t>
       </w:r>
-      <w:hyperlink w:history="1" r:id="rIdof56w2suzwtx8pgq1dbii">
+      <w:hyperlink w:history="1" r:id="rIdtuenmxy5fryzxs0hl1nln">
         <w:r>
           <w:rPr>
             <w:rFonts w:ascii="Calibri" w:cs="Calibri" w:eastAsia="Calibri" w:hAnsi="Calibri"/>
@@ -1371,7 +1371,7 @@
         </w:rPr>
         <w:t xml:space="preserve"> </w:t>
       </w:r>
-      <w:hyperlink w:history="1" r:id="rIdypokfxlc51k1uqtzy7bfl">
+      <w:hyperlink w:history="1" r:id="rId12spxqrikwi0cxkeosybp">
         <w:r>
           <w:rPr>
             <w:rFonts w:ascii="Calibri" w:cs="Calibri" w:eastAsia="Calibri" w:hAnsi="Calibri"/>
@@ -1391,7 +1391,7 @@
         </w:rPr>
         <w:t xml:space="preserve"> </w:t>
       </w:r>
-      <w:hyperlink w:history="1" r:id="rIdopr7s1pyrvgysjommu02c">
+      <w:hyperlink w:history="1" r:id="rIdsqhmzxxoav37yrjsmry2k">
         <w:r>
           <w:rPr>
             <w:rFonts w:ascii="Calibri" w:cs="Calibri" w:eastAsia="Calibri" w:hAnsi="Calibri"/>
@@ -1411,7 +1411,7 @@
         </w:rPr>
         <w:t xml:space="preserve"> </w:t>
       </w:r>
-      <w:hyperlink w:history="1" r:id="rId9iac6uuc__uoib94sqimh">
+      <w:hyperlink w:history="1" r:id="rIdomb5pucyvewf8nav-9rz6">
         <w:r>
           <w:rPr>
             <w:rFonts w:ascii="Calibri" w:cs="Calibri" w:eastAsia="Calibri" w:hAnsi="Calibri"/>
@@ -1450,7 +1450,7 @@
         </w:rPr>
         <w:t xml:space="preserve"> </w:t>
       </w:r>
-      <w:hyperlink w:history="1" r:id="rIdtamjfxzednfm-a9an6_xp">
+      <w:hyperlink w:history="1" r:id="rIdjsvv5wt9ofs-dmdgj6afs">
         <w:r>
           <w:rPr>
             <w:rFonts w:ascii="Calibri" w:cs="Calibri" w:eastAsia="Calibri" w:hAnsi="Calibri"/>
@@ -1470,7 +1470,7 @@
         </w:rPr>
         <w:t xml:space="preserve"> </w:t>
       </w:r>
-      <w:hyperlink w:history="1" r:id="rIdtjo32ceelc6sbizqpdohb">
+      <w:hyperlink w:history="1" r:id="rIddloopmh9yb0g4nk9b_-2g">
         <w:r>
           <w:rPr>
             <w:rFonts w:ascii="Calibri" w:cs="Calibri" w:eastAsia="Calibri" w:hAnsi="Calibri"/>
@@ -1490,7 +1490,7 @@
         </w:rPr>
         <w:t xml:space="preserve"> </w:t>
       </w:r>
-      <w:hyperlink w:history="1" r:id="rIdo8ivgb7wb9jxfnoxyxfdn">
+      <w:hyperlink w:history="1" r:id="rIdwyrjl_en2fa_plsk47dsz">
         <w:r>
           <w:rPr>
             <w:rFonts w:ascii="Calibri" w:cs="Calibri" w:eastAsia="Calibri" w:hAnsi="Calibri"/>
@@ -1529,7 +1529,7 @@
         </w:rPr>
         <w:t xml:space="preserve"> </w:t>
       </w:r>
-      <w:hyperlink w:history="1" r:id="rIdj7kcz1ktinxruo1l1kcro">
+      <w:hyperlink w:history="1" r:id="rIddxj2u4rytcmtprljqqovd">
         <w:r>
           <w:rPr>
             <w:rFonts w:ascii="Calibri" w:cs="Calibri" w:eastAsia="Calibri" w:hAnsi="Calibri"/>
@@ -1568,7 +1568,7 @@
         </w:rPr>
         <w:t xml:space="preserve"> </w:t>
       </w:r>
-      <w:hyperlink w:history="1" r:id="rIdgpyonz2gvtktdx8iyhlex">
+      <w:hyperlink w:history="1" r:id="rIdyknhcmn_mk7ujz8depmqf">
         <w:r>
           <w:rPr>
             <w:rFonts w:ascii="Calibri" w:cs="Calibri" w:eastAsia="Calibri" w:hAnsi="Calibri"/>
@@ -1588,7 +1588,7 @@
         </w:rPr>
         <w:t xml:space="preserve"> </w:t>
       </w:r>
-      <w:hyperlink w:history="1" r:id="rId_ldzomlxw25oskz3rmqxs">
+      <w:hyperlink w:history="1" r:id="rIdhavfdn5sa0xqj8zzoy5ct">
         <w:r>
           <w:rPr>
             <w:rFonts w:ascii="Calibri" w:cs="Calibri" w:eastAsia="Calibri" w:hAnsi="Calibri"/>
@@ -1627,7 +1627,7 @@
         </w:rPr>
         <w:t xml:space="preserve"> </w:t>
       </w:r>
-      <w:hyperlink w:history="1" r:id="rId9dtsooivaj5a7j4_kauwa">
+      <w:hyperlink w:history="1" r:id="rIdbewuoqoslvoqwlhctcy8v">
         <w:r>
           <w:rPr>
             <w:rFonts w:ascii="Calibri" w:cs="Calibri" w:eastAsia="Calibri" w:hAnsi="Calibri"/>
@@ -1647,7 +1647,7 @@
         </w:rPr>
         <w:t xml:space="preserve"> </w:t>
       </w:r>
-      <w:hyperlink w:history="1" r:id="rId5konfj8tjw38wj66ynlkz">
+      <w:hyperlink w:history="1" r:id="rIddcezx5ixosulafxzbzwok">
         <w:r>
           <w:rPr>
             <w:rFonts w:ascii="Calibri" w:cs="Calibri" w:eastAsia="Calibri" w:hAnsi="Calibri"/>
@@ -1667,7 +1667,7 @@
         </w:rPr>
         <w:t xml:space="preserve"> </w:t>
       </w:r>
-      <w:hyperlink w:history="1" r:id="rIdhpvjsg1qwmy3uvcch1lv5">
+      <w:hyperlink w:history="1" r:id="rIdvxgn0zkjttnh5kcjpmumg">
         <w:r>
           <w:rPr>
             <w:rFonts w:ascii="Calibri" w:cs="Calibri" w:eastAsia="Calibri" w:hAnsi="Calibri"/>
@@ -1687,7 +1687,7 @@
         </w:rPr>
         <w:t xml:space="preserve"> </w:t>
       </w:r>
-      <w:hyperlink w:history="1" r:id="rIdaruwia06ckssuex_bq8j9">
+      <w:hyperlink w:history="1" r:id="rId0i8ftl3phve7mazabyhpo">
         <w:r>
           <w:rPr>
             <w:rFonts w:ascii="Calibri" w:cs="Calibri" w:eastAsia="Calibri" w:hAnsi="Calibri"/>
@@ -1742,7 +1742,7 @@
         </w:rPr>
         <w:t xml:space="preserve"> </w:t>
       </w:r>
-      <w:hyperlink w:history="1" r:id="rId2qwebfhxwfz1h8ey8vb4h">
+      <w:hyperlink w:history="1" r:id="rIdy1zjf3ynir20rdqyvjex3">
         <w:r>
           <w:rPr>
             <w:rFonts w:ascii="Calibri" w:cs="Calibri" w:eastAsia="Calibri" w:hAnsi="Calibri"/>
@@ -1781,7 +1781,7 @@
         </w:rPr>
         <w:t xml:space="preserve"> </w:t>
       </w:r>
-      <w:hyperlink w:history="1" r:id="rIdlcvva2xjsf3_ufcvmoacu">
+      <w:hyperlink w:history="1" r:id="rIdcvwave0nljlhzfvjfcqrw">
         <w:r>
           <w:rPr>
             <w:rFonts w:ascii="Calibri" w:cs="Calibri" w:eastAsia="Calibri" w:hAnsi="Calibri"/>
@@ -1801,7 +1801,7 @@
         </w:rPr>
         <w:t xml:space="preserve"> </w:t>
       </w:r>
-      <w:hyperlink w:history="1" r:id="rIdcb57mowns5dl1lblxbcfi">
+      <w:hyperlink w:history="1" r:id="rIdqpgwrvxii4rltjf1yvqv5">
         <w:r>
           <w:rPr>
             <w:rFonts w:ascii="Calibri" w:cs="Calibri" w:eastAsia="Calibri" w:hAnsi="Calibri"/>
@@ -1821,7 +1821,7 @@
         </w:rPr>
         <w:t xml:space="preserve"> </w:t>
       </w:r>
-      <w:hyperlink w:history="1" r:id="rIdwhlwsr_crvofhus3hdytr">
+      <w:hyperlink w:history="1" r:id="rId1lxelrya3sbazhm0l9ylo">
         <w:r>
           <w:rPr>
             <w:rFonts w:ascii="Calibri" w:cs="Calibri" w:eastAsia="Calibri" w:hAnsi="Calibri"/>
@@ -1860,7 +1860,7 @@
         </w:rPr>
         <w:t xml:space="preserve"> </w:t>
       </w:r>
-      <w:hyperlink w:history="1" r:id="rIdquqnuykb965yw1wcpvvza">
+      <w:hyperlink w:history="1" r:id="rIdqvfizipgfuauwqndl0l0w">
         <w:r>
           <w:rPr>
             <w:rFonts w:ascii="Calibri" w:cs="Calibri" w:eastAsia="Calibri" w:hAnsi="Calibri"/>
@@ -1880,7 +1880,7 @@
         </w:rPr>
         <w:t xml:space="preserve"> </w:t>
       </w:r>
-      <w:hyperlink w:history="1" r:id="rIdppxg1gezhxdxyfeokrxe5">
+      <w:hyperlink w:history="1" r:id="rIdvs2uyzgmy8xi8wc9_mxqs">
         <w:r>
           <w:rPr>
             <w:rFonts w:ascii="Calibri" w:cs="Calibri" w:eastAsia="Calibri" w:hAnsi="Calibri"/>
@@ -1900,7 +1900,7 @@
         </w:rPr>
         <w:t xml:space="preserve"> </w:t>
       </w:r>
-      <w:hyperlink w:history="1" r:id="rIdupbizqij_ixaxqsfuohjs">
+      <w:hyperlink w:history="1" r:id="rIdwrhdtfq9ilt-pfooc0ihg">
         <w:r>
           <w:rPr>
             <w:rFonts w:ascii="Calibri" w:cs="Calibri" w:eastAsia="Calibri" w:hAnsi="Calibri"/>
@@ -1939,7 +1939,7 @@
         </w:rPr>
         <w:t xml:space="preserve"> </w:t>
       </w:r>
-      <w:hyperlink w:history="1" r:id="rIdvxtjrtib-j_sfz3umu2gu">
+      <w:hyperlink w:history="1" r:id="rIdjw_vjn9702czt-fqopzri">
         <w:r>
           <w:rPr>
             <w:rFonts w:ascii="Calibri" w:cs="Calibri" w:eastAsia="Calibri" w:hAnsi="Calibri"/>
@@ -1959,7 +1959,7 @@
         </w:rPr>
         <w:t xml:space="preserve"> </w:t>
       </w:r>
-      <w:hyperlink w:history="1" r:id="rIdbxy9uwqt1awdwhztnkemp">
+      <w:hyperlink w:history="1" r:id="rIdi0dxoqunkh_h7ukcb24wk">
         <w:r>
           <w:rPr>
             <w:rFonts w:ascii="Calibri" w:cs="Calibri" w:eastAsia="Calibri" w:hAnsi="Calibri"/>
@@ -1979,7 +1979,7 @@
         </w:rPr>
         <w:t xml:space="preserve"> </w:t>
       </w:r>
-      <w:hyperlink w:history="1" r:id="rIdpstlfjoxoydyyizpatmme">
+      <w:hyperlink w:history="1" r:id="rIdg9cllnjneartnhbj4bngt">
         <w:r>
           <w:rPr>
             <w:rFonts w:ascii="Calibri" w:cs="Calibri" w:eastAsia="Calibri" w:hAnsi="Calibri"/>
@@ -2018,7 +2018,7 @@
         </w:rPr>
         <w:t xml:space="preserve"> </w:t>
       </w:r>
-      <w:hyperlink w:history="1" r:id="rIdgxtrolkx8ad3bzsq2iho1">
+      <w:hyperlink w:history="1" r:id="rIdc8mbsmjqqszrpgo6yji38">
         <w:r>
           <w:rPr>
             <w:rFonts w:ascii="Calibri" w:cs="Calibri" w:eastAsia="Calibri" w:hAnsi="Calibri"/>
@@ -2057,7 +2057,7 @@
         </w:rPr>
         <w:t xml:space="preserve"> </w:t>
       </w:r>
-      <w:hyperlink w:history="1" r:id="rIdukir4zsqdy9w4ttyranhl">
+      <w:hyperlink w:history="1" r:id="rIdrp6wb9yecv5mprzwqa6kf">
         <w:r>
           <w:rPr>
             <w:rFonts w:ascii="Calibri" w:cs="Calibri" w:eastAsia="Calibri" w:hAnsi="Calibri"/>
@@ -2077,7 +2077,7 @@
         </w:rPr>
         <w:t xml:space="preserve"> </w:t>
       </w:r>
-      <w:hyperlink w:history="1" r:id="rIdehpwfk4pw8mqwhvnuvihf">
+      <w:hyperlink w:history="1" r:id="rIdclvuttjz_kdnyif0x-ywe">
         <w:r>
           <w:rPr>
             <w:rFonts w:ascii="Calibri" w:cs="Calibri" w:eastAsia="Calibri" w:hAnsi="Calibri"/>
@@ -2116,7 +2116,7 @@
         </w:rPr>
         <w:t xml:space="preserve"> </w:t>
       </w:r>
-      <w:hyperlink w:history="1" r:id="rIdigkhmi-yhydnjqot4xgvm">
+      <w:hyperlink w:history="1" r:id="rIdcbtapok4abqypi-bq-f78">
         <w:r>
           <w:rPr>
             <w:rFonts w:ascii="Calibri" w:cs="Calibri" w:eastAsia="Calibri" w:hAnsi="Calibri"/>
@@ -2136,7 +2136,7 @@
         </w:rPr>
         <w:t xml:space="preserve"> </w:t>
       </w:r>
-      <w:hyperlink w:history="1" r:id="rIdfcdyr-mrqxj--1kmdw905">
+      <w:hyperlink w:history="1" r:id="rIdtjrz0vrgwqffxogskzw1r">
         <w:r>
           <w:rPr>
             <w:rFonts w:ascii="Calibri" w:cs="Calibri" w:eastAsia="Calibri" w:hAnsi="Calibri"/>
@@ -2374,7 +2374,7 @@
         </w:numPr>
         <w:spacing w:after="50" w:line="259"/>
       </w:pPr>
-      <w:hyperlink w:history="1" r:id="rIdaeiiogwpir8zaduyv3ab_">
+      <w:hyperlink w:history="1" r:id="rIdvhpge_tfbreso31kirjid">
         <w:r>
           <w:rPr>
             <w:rFonts w:ascii="Calibri" w:cs="Calibri" w:eastAsia="Calibri" w:hAnsi="Calibri"/>
@@ -2405,7 +2405,7 @@
         </w:numPr>
         <w:spacing w:after="50" w:line="259"/>
       </w:pPr>
-      <w:hyperlink w:history="1" r:id="rIdjnqldwcbbjbhp_8luabxv">
+      <w:hyperlink w:history="1" r:id="rIdnyocnzmmyzmlpw9irp5fy">
         <w:r>
           <w:rPr>
             <w:rFonts w:ascii="Calibri" w:cs="Calibri" w:eastAsia="Calibri" w:hAnsi="Calibri"/>
@@ -2436,7 +2436,7 @@
         </w:numPr>
         <w:spacing w:after="50" w:line="259"/>
       </w:pPr>
-      <w:hyperlink w:history="1" r:id="rIdgsbqueu7ranocyf1aggbv">
+      <w:hyperlink w:history="1" r:id="rIdtvknckg0ba6bzmlhgspcb">
         <w:r>
           <w:rPr>
             <w:rFonts w:ascii="Calibri" w:cs="Calibri" w:eastAsia="Calibri" w:hAnsi="Calibri"/>
@@ -2467,7 +2467,7 @@
         </w:numPr>
         <w:spacing w:after="50" w:line="259"/>
       </w:pPr>
-      <w:hyperlink w:history="1" r:id="rIdoo_lh3jo55ru8060slbip">
+      <w:hyperlink w:history="1" r:id="rIdinxtpmdpx1xqnsx7t8pbj">
         <w:r>
           <w:rPr>
             <w:rFonts w:ascii="Calibri" w:cs="Calibri" w:eastAsia="Calibri" w:hAnsi="Calibri"/>
@@ -2498,7 +2498,7 @@
         </w:numPr>
         <w:spacing w:after="50" w:line="259"/>
       </w:pPr>
-      <w:hyperlink w:history="1" r:id="rId2urrqjb3a4x5ueyznxuck">
+      <w:hyperlink w:history="1" r:id="rIdndgxk5sgsoag9wrpqtawo">
         <w:r>
           <w:rPr>
             <w:rFonts w:ascii="Calibri" w:cs="Calibri" w:eastAsia="Calibri" w:hAnsi="Calibri"/>
@@ -2529,7 +2529,7 @@
         </w:numPr>
         <w:spacing w:after="50" w:line="259"/>
       </w:pPr>
-      <w:hyperlink w:history="1" r:id="rId3yzcprktlzageqjmcyehv">
+      <w:hyperlink w:history="1" r:id="rId47uodlxvigb3jabbgovoq">
         <w:r>
           <w:rPr>
             <w:rFonts w:ascii="Calibri" w:cs="Calibri" w:eastAsia="Calibri" w:hAnsi="Calibri"/>
@@ -2560,7 +2560,7 @@
         </w:numPr>
         <w:spacing w:after="50" w:line="259"/>
       </w:pPr>
-      <w:hyperlink w:history="1" r:id="rIdhh44m7z9qekbmr94xj9d9">
+      <w:hyperlink w:history="1" r:id="rIdcd8qks77gwboyl-rrnd-s">
         <w:r>
           <w:rPr>
             <w:rFonts w:ascii="Calibri" w:cs="Calibri" w:eastAsia="Calibri" w:hAnsi="Calibri"/>
@@ -2591,7 +2591,7 @@
         </w:numPr>
         <w:spacing w:after="50" w:line="259"/>
       </w:pPr>
-      <w:hyperlink w:history="1" r:id="rIdirnjuf-fl3segxten8qiq">
+      <w:hyperlink w:history="1" r:id="rIdoxftjfbhvcsn1mmins8-9">
         <w:r>
           <w:rPr>
             <w:rFonts w:ascii="Calibri" w:cs="Calibri" w:eastAsia="Calibri" w:hAnsi="Calibri"/>
@@ -2622,7 +2622,7 @@
         </w:numPr>
         <w:spacing w:after="50" w:line="259"/>
       </w:pPr>
-      <w:hyperlink w:history="1" r:id="rIdk23crmhfyg0ytt6vqpwok">
+      <w:hyperlink w:history="1" r:id="rIdlw_vnz0af-4_yhxcdrmf8">
         <w:r>
           <w:rPr>
             <w:rFonts w:ascii="Calibri" w:cs="Calibri" w:eastAsia="Calibri" w:hAnsi="Calibri"/>
@@ -2653,7 +2653,7 @@
         </w:numPr>
         <w:spacing w:after="50" w:line="259"/>
       </w:pPr>
-      <w:hyperlink w:history="1" r:id="rIdlyj0ub6fmcd_36yer5xn5">
+      <w:hyperlink w:history="1" r:id="rIdkx_lrdeo5k01vyn72xwgp">
         <w:r>
           <w:rPr>
             <w:rFonts w:ascii="Calibri" w:cs="Calibri" w:eastAsia="Calibri" w:hAnsi="Calibri"/>
@@ -2684,7 +2684,7 @@
         </w:numPr>
         <w:spacing w:after="50" w:line="259"/>
       </w:pPr>
-      <w:hyperlink w:history="1" r:id="rIdncda3wzgcakawrtkpsgsi">
+      <w:hyperlink w:history="1" r:id="rIdchctewtp2wfhpt5zstafe">
         <w:r>
           <w:rPr>
             <w:rFonts w:ascii="Calibri" w:cs="Calibri" w:eastAsia="Calibri" w:hAnsi="Calibri"/>
@@ -2715,7 +2715,7 @@
         </w:numPr>
         <w:spacing w:after="50" w:line="259"/>
       </w:pPr>
-      <w:hyperlink w:history="1" r:id="rId38pybcjozdxjdm7sndphi">
+      <w:hyperlink w:history="1" r:id="rIdarqumqipcuuvl-lvk1ozk">
         <w:r>
           <w:rPr>
             <w:rFonts w:ascii="Calibri" w:cs="Calibri" w:eastAsia="Calibri" w:hAnsi="Calibri"/>
@@ -2746,7 +2746,7 @@
         </w:numPr>
         <w:spacing w:after="50" w:line="259"/>
       </w:pPr>
-      <w:hyperlink w:history="1" r:id="rIdx4s-bpzonikzvq_igfyim">
+      <w:hyperlink w:history="1" r:id="rIdmnsk2dr_y7vxfqakhmlra">
         <w:r>
           <w:rPr>
             <w:rFonts w:ascii="Calibri" w:cs="Calibri" w:eastAsia="Calibri" w:hAnsi="Calibri"/>
@@ -2777,7 +2777,7 @@
         </w:numPr>
         <w:spacing w:after="50" w:line="259"/>
       </w:pPr>
-      <w:hyperlink w:history="1" r:id="rIdijlkh28e5h67mrjywl6zv">
+      <w:hyperlink w:history="1" r:id="rIdpvehzs9tfhdfn7vsguo0z">
         <w:r>
           <w:rPr>
             <w:rFonts w:ascii="Calibri" w:cs="Calibri" w:eastAsia="Calibri" w:hAnsi="Calibri"/>
@@ -2808,7 +2808,7 @@
         </w:numPr>
         <w:spacing w:after="50" w:line="259"/>
       </w:pPr>
-      <w:hyperlink w:history="1" r:id="rIdnya5t_gdavt-fvi84pomz">
+      <w:hyperlink w:history="1" r:id="rIdgq7limrwwtnlmwacn7tjm">
         <w:r>
           <w:rPr>
             <w:rFonts w:ascii="Calibri" w:cs="Calibri" w:eastAsia="Calibri" w:hAnsi="Calibri"/>
@@ -2839,7 +2839,7 @@
         </w:numPr>
         <w:spacing w:after="50" w:line="259"/>
       </w:pPr>
-      <w:hyperlink w:history="1" r:id="rIdqoxdsg7bfy2rw__iv_rtl">
+      <w:hyperlink w:history="1" r:id="rIdnt-q3ricjzpf1_mtfvwzc">
         <w:r>
           <w:rPr>
             <w:rFonts w:ascii="Calibri" w:cs="Calibri" w:eastAsia="Calibri" w:hAnsi="Calibri"/>
@@ -2870,7 +2870,7 @@
         </w:numPr>
         <w:spacing w:after="50" w:line="259"/>
       </w:pPr>
-      <w:hyperlink w:history="1" r:id="rIdjaezrpf9ayah9co63ybm5">
+      <w:hyperlink w:history="1" r:id="rIddjqycl4dghtpzjzpxalmc">
         <w:r>
           <w:rPr>
             <w:rFonts w:ascii="Calibri" w:cs="Calibri" w:eastAsia="Calibri" w:hAnsi="Calibri"/>

</xml_diff>